<commit_message>
Final report & presentation
</commit_message>
<xml_diff>
--- a/Project 3/Reports/Marshall Roll Project 3 Report.docx
+++ b/Project 3/Reports/Marshall Roll Project 3 Report.docx
@@ -33,23 +33,7 @@
           <w:b/>
           <w:bCs/>
         </w:rPr>
-        <w:t xml:space="preserve">Stroke in </w:t>
-      </w:r>
-      <w:r>
-        <w:rPr>
-          <w:rFonts w:ascii="Arial" w:hAnsi="Arial" w:cs="Arial"/>
-          <w:b/>
-          <w:bCs/>
-        </w:rPr>
-        <w:t>Framingham Heart Study</w:t>
-      </w:r>
-      <w:r>
-        <w:rPr>
-          <w:rFonts w:ascii="Arial" w:hAnsi="Arial" w:cs="Arial"/>
-          <w:b/>
-          <w:bCs/>
-        </w:rPr>
-        <w:t xml:space="preserve"> </w:t>
+        <w:t xml:space="preserve">Stroke in Framingham Heart Study </w:t>
       </w:r>
     </w:p>
     <w:p>
@@ -390,13 +374,49 @@
         <w:rPr>
           <w:rFonts w:ascii="Arial" w:hAnsi="Arial" w:cs="Arial"/>
         </w:rPr>
-        <w:t>covariate missingness is determined to be ignorable,</w:t>
-      </w:r>
-      <w:r>
-        <w:rPr>
-          <w:rFonts w:ascii="Arial" w:hAnsi="Arial" w:cs="Arial"/>
-        </w:rPr>
-        <w:t xml:space="preserve"> two separate complete case analyses (all covariates measured in first period) will be conducted. Variable selection will be carried out using a penalized Cox proportional hazards model</w:t>
+        <w:t xml:space="preserve">covariate missingness </w:t>
+      </w:r>
+      <w:r>
+        <w:rPr>
+          <w:rFonts w:ascii="Arial" w:hAnsi="Arial" w:cs="Arial"/>
+        </w:rPr>
+        <w:t>was</w:t>
+      </w:r>
+      <w:r>
+        <w:rPr>
+          <w:rFonts w:ascii="Arial" w:hAnsi="Arial" w:cs="Arial"/>
+        </w:rPr>
+        <w:t xml:space="preserve"> determined to be ignorable,</w:t>
+      </w:r>
+      <w:r>
+        <w:rPr>
+          <w:rFonts w:ascii="Arial" w:hAnsi="Arial" w:cs="Arial"/>
+        </w:rPr>
+        <w:t xml:space="preserve"> two separate complete case analyses (all covariates measured in first period) </w:t>
+      </w:r>
+      <w:r>
+        <w:rPr>
+          <w:rFonts w:ascii="Arial" w:hAnsi="Arial" w:cs="Arial"/>
+        </w:rPr>
+        <w:t>were</w:t>
+      </w:r>
+      <w:r>
+        <w:rPr>
+          <w:rFonts w:ascii="Arial" w:hAnsi="Arial" w:cs="Arial"/>
+        </w:rPr>
+        <w:t xml:space="preserve"> conducted. Variable selection </w:t>
+      </w:r>
+      <w:r>
+        <w:rPr>
+          <w:rFonts w:ascii="Arial" w:hAnsi="Arial" w:cs="Arial"/>
+        </w:rPr>
+        <w:t>was</w:t>
+      </w:r>
+      <w:r>
+        <w:rPr>
+          <w:rFonts w:ascii="Arial" w:hAnsi="Arial" w:cs="Arial"/>
+        </w:rPr>
+        <w:t xml:space="preserve"> carried out using a penalized Cox proportional hazards model</w:t>
       </w:r>
       <w:r>
         <w:rPr>
@@ -414,13 +434,91 @@
         <w:rPr>
           <w:rFonts w:ascii="Arial" w:hAnsi="Arial" w:cs="Arial"/>
         </w:rPr>
-        <w:t xml:space="preserve">Age, systolic blood pressure, and diabetes will be forced into the model due to their clinical importance, while coronary heart disease (CHD), blood pressure medications, smoking status, total cholesterol levels, and BMI will be considered as candidate variables. </w:t>
-      </w:r>
-      <w:r>
-        <w:rPr>
-          <w:rFonts w:ascii="Arial" w:hAnsi="Arial" w:cs="Arial"/>
-        </w:rPr>
-        <w:t>No constraints on equivalent covariates between the two models were employed</w:t>
+        <w:t xml:space="preserve">Age, systolic blood pressure, and diabetes </w:t>
+      </w:r>
+      <w:r>
+        <w:rPr>
+          <w:rFonts w:ascii="Arial" w:hAnsi="Arial" w:cs="Arial"/>
+        </w:rPr>
+        <w:t>were</w:t>
+      </w:r>
+      <w:r>
+        <w:rPr>
+          <w:rFonts w:ascii="Arial" w:hAnsi="Arial" w:cs="Arial"/>
+        </w:rPr>
+        <w:t xml:space="preserve"> forced into the model due to their clinical importance, while coronary heart disease (CHD), blood pressure medications, smoking status, total cholesterol levels, and BMI </w:t>
+      </w:r>
+      <w:r>
+        <w:rPr>
+          <w:rFonts w:ascii="Arial" w:hAnsi="Arial" w:cs="Arial"/>
+        </w:rPr>
+        <w:t>were</w:t>
+      </w:r>
+      <w:r>
+        <w:rPr>
+          <w:rFonts w:ascii="Arial" w:hAnsi="Arial" w:cs="Arial"/>
+        </w:rPr>
+        <w:t xml:space="preserve"> considered as candidate </w:t>
+      </w:r>
+      <w:r>
+        <w:rPr>
+          <w:rFonts w:ascii="Arial" w:hAnsi="Arial" w:cs="Arial"/>
+        </w:rPr>
+        <w:t>predictors</w:t>
+      </w:r>
+      <w:r>
+        <w:rPr>
+          <w:rFonts w:ascii="Arial" w:hAnsi="Arial" w:cs="Arial"/>
+        </w:rPr>
+        <w:t xml:space="preserve">. </w:t>
+      </w:r>
+      <w:r>
+        <w:rPr>
+          <w:rFonts w:ascii="Arial" w:hAnsi="Arial" w:cs="Arial"/>
+        </w:rPr>
+        <w:t xml:space="preserve">No constraints on equivalent covariates between the two models were employed, as explaining variability within each sex was prioritized rather than consistency to assess differences between sexes. </w:t>
+      </w:r>
+      <w:r>
+        <w:rPr>
+          <w:rFonts w:ascii="Arial" w:hAnsi="Arial" w:cs="Arial"/>
+        </w:rPr>
+        <w:t xml:space="preserve">The magnitude of the penalty term </w:t>
+      </w:r>
+      <w:r>
+        <w:rPr>
+          <w:rFonts w:ascii="Arial" w:hAnsi="Arial" w:cs="Arial"/>
+        </w:rPr>
+        <w:t>was</w:t>
+      </w:r>
+      <w:r>
+        <w:rPr>
+          <w:rFonts w:ascii="Arial" w:hAnsi="Arial" w:cs="Arial"/>
+        </w:rPr>
+        <w:t xml:space="preserve"> determined by choosing a parameter that is stable across random samples (i.e., selects the same predictors across different random seeds)</w:t>
+      </w:r>
+      <w:r>
+        <w:rPr>
+          <w:rFonts w:ascii="Arial" w:hAnsi="Arial" w:cs="Arial"/>
+        </w:rPr>
+        <w:t xml:space="preserve"> and is greater than or equal to the penalty that minimizes mean cross-validated error but within 1 standard error of the minimum penalty. Risk of stroke was then evaluated using Cox proportional hazard models with the variables selected by the LASSO procedure for each sex. The proportional hazards assumption for each covariate was assessed using Schoenfeld residuals (global p-value threshold: 0.05) and multicollinearity with other covariates using VIF screening (threshold: 5). Hazard ratios with 95% confidence intervals were calculated for each selected covariate, as well as ten-year stroke probabilities for both sexes at age 40, 50, and 60 across the following risk profiles: no baseline risk (determined as the mean level of continuous variables and the absence of categorical risk factors), </w:t>
+      </w:r>
+      <w:r>
+        <w:rPr>
+          <w:rFonts w:ascii="Arial" w:hAnsi="Arial" w:cs="Arial"/>
+        </w:rPr>
+        <w:t>high blood pressure (</w:t>
+      </w:r>
+      <w:r>
+        <w:rPr>
+          <w:rFonts w:ascii="Arial" w:hAnsi="Arial" w:cs="Arial"/>
+        </w:rPr>
+        <w:t>systolic blood pressure = 160</w:t>
+      </w:r>
+      <w:r>
+        <w:rPr>
+          <w:rFonts w:ascii="Arial" w:hAnsi="Arial" w:cs="Arial"/>
+        </w:rPr>
+        <w:t>)</w:t>
       </w:r>
       <w:r>
         <w:rPr>
@@ -432,49 +530,128 @@
         <w:rPr>
           <w:rFonts w:ascii="Arial" w:hAnsi="Arial" w:cs="Arial"/>
         </w:rPr>
-        <w:t xml:space="preserve"> as</w:t>
-      </w:r>
-      <w:r>
-        <w:rPr>
-          <w:rFonts w:ascii="Arial" w:hAnsi="Arial" w:cs="Arial"/>
-        </w:rPr>
-        <w:t xml:space="preserve"> explaining variability within each sex </w:t>
-      </w:r>
-      <w:r>
-        <w:rPr>
-          <w:rFonts w:ascii="Arial" w:hAnsi="Arial" w:cs="Arial"/>
-        </w:rPr>
-        <w:t xml:space="preserve">was </w:t>
-      </w:r>
-      <w:r>
-        <w:rPr>
-          <w:rFonts w:ascii="Arial" w:hAnsi="Arial" w:cs="Arial"/>
-        </w:rPr>
-        <w:t>prioritiz</w:t>
-      </w:r>
-      <w:r>
-        <w:rPr>
-          <w:rFonts w:ascii="Arial" w:hAnsi="Arial" w:cs="Arial"/>
-        </w:rPr>
-        <w:t>ed</w:t>
-      </w:r>
-      <w:r>
-        <w:rPr>
-          <w:rFonts w:ascii="Arial" w:hAnsi="Arial" w:cs="Arial"/>
-        </w:rPr>
-        <w:t xml:space="preserve"> rather than consistency to assess differences between sexes. </w:t>
-      </w:r>
-      <w:r>
-        <w:rPr>
-          <w:rFonts w:ascii="Arial" w:hAnsi="Arial" w:cs="Arial"/>
-        </w:rPr>
-        <w:t xml:space="preserve">The magnitude of the penalty term will be determined by choosing a parameter that is stable across random samples </w:t>
-      </w:r>
-      <w:r>
-        <w:rPr>
-          <w:rFonts w:ascii="Arial" w:hAnsi="Arial" w:cs="Arial"/>
-        </w:rPr>
-        <w:t>(i</w:t>
+        <w:t xml:space="preserve"> diabetes</w:t>
+      </w:r>
+      <w:r>
+        <w:rPr>
+          <w:rFonts w:ascii="Arial" w:hAnsi="Arial" w:cs="Arial"/>
+        </w:rPr>
+        <w:t xml:space="preserve">, </w:t>
+      </w:r>
+      <w:r>
+        <w:rPr>
+          <w:rFonts w:ascii="Arial" w:hAnsi="Arial" w:cs="Arial"/>
+        </w:rPr>
+        <w:t>high blood pressure and diabetes</w:t>
+      </w:r>
+      <w:r>
+        <w:rPr>
+          <w:rFonts w:ascii="Arial" w:hAnsi="Arial" w:cs="Arial"/>
+        </w:rPr>
+        <w:t xml:space="preserve">, and </w:t>
+      </w:r>
+      <w:r>
+        <w:rPr>
+          <w:rFonts w:ascii="Arial" w:hAnsi="Arial" w:cs="Arial"/>
+        </w:rPr>
+        <w:lastRenderedPageBreak/>
+        <w:t xml:space="preserve">smoking. </w:t>
+      </w:r>
+      <w:r>
+        <w:rPr>
+          <w:rFonts w:ascii="Arial" w:hAnsi="Arial" w:cs="Arial"/>
+        </w:rPr>
+        <w:t xml:space="preserve">Final model discrimination </w:t>
+      </w:r>
+      <w:r>
+        <w:rPr>
+          <w:rFonts w:ascii="Arial" w:hAnsi="Arial" w:cs="Arial"/>
+        </w:rPr>
+        <w:t>was</w:t>
+      </w:r>
+      <w:r>
+        <w:rPr>
+          <w:rFonts w:ascii="Arial" w:hAnsi="Arial" w:cs="Arial"/>
+        </w:rPr>
+        <w:t xml:space="preserve"> evaluated using c-statistics. </w:t>
+      </w:r>
+      <w:r>
+        <w:rPr>
+          <w:rFonts w:ascii="Arial" w:hAnsi="Arial" w:cs="Arial"/>
+        </w:rPr>
+        <w:t xml:space="preserve">Competing risks such as death and myocardial infarction </w:t>
+      </w:r>
+      <w:r>
+        <w:rPr>
+          <w:rFonts w:ascii="Arial" w:hAnsi="Arial" w:cs="Arial"/>
+        </w:rPr>
+        <w:t>were</w:t>
+      </w:r>
+      <w:r>
+        <w:rPr>
+          <w:rFonts w:ascii="Arial" w:hAnsi="Arial" w:cs="Arial"/>
+        </w:rPr>
+        <w:t xml:space="preserve"> not considered in primary analysis. </w:t>
+      </w:r>
+      <w:r>
+        <w:rPr>
+          <w:rFonts w:ascii="Arial" w:hAnsi="Arial" w:cs="Arial"/>
+        </w:rPr>
+        <w:t>Secondary descriptive analysis present</w:t>
+      </w:r>
+      <w:r>
+        <w:rPr>
+          <w:rFonts w:ascii="Arial" w:hAnsi="Arial" w:cs="Arial"/>
+        </w:rPr>
+        <w:t xml:space="preserve">ed </w:t>
+      </w:r>
+      <w:r>
+        <w:rPr>
+          <w:rFonts w:ascii="Arial" w:hAnsi="Arial" w:cs="Arial"/>
+        </w:rPr>
+        <w:t xml:space="preserve">the mean and standard deviation of risk factors over the three </w:t>
+      </w:r>
+      <w:r>
+        <w:rPr>
+          <w:rFonts w:ascii="Arial" w:hAnsi="Arial" w:cs="Arial"/>
+        </w:rPr>
+        <w:t>study periods</w:t>
+      </w:r>
+      <w:r>
+        <w:rPr>
+          <w:rFonts w:ascii="Arial" w:hAnsi="Arial" w:cs="Arial"/>
+        </w:rPr>
+        <w:t xml:space="preserve"> to determine if a more complex time-varying survival analysis may be more appropriate</w:t>
+      </w:r>
+      <w:r>
+        <w:rPr>
+          <w:rFonts w:ascii="Arial" w:hAnsi="Arial" w:cs="Arial"/>
+        </w:rPr>
+        <w:t xml:space="preserve">; no statistical testing </w:t>
+      </w:r>
+      <w:r>
+        <w:rPr>
+          <w:rFonts w:ascii="Arial" w:hAnsi="Arial" w:cs="Arial"/>
+        </w:rPr>
+        <w:t>was</w:t>
+      </w:r>
+      <w:r>
+        <w:rPr>
+          <w:rFonts w:ascii="Arial" w:hAnsi="Arial" w:cs="Arial"/>
+        </w:rPr>
+        <w:t xml:space="preserve"> conducted as meaningful differences </w:t>
+      </w:r>
+      <w:r>
+        <w:rPr>
+          <w:rFonts w:ascii="Arial" w:hAnsi="Arial" w:cs="Arial"/>
+        </w:rPr>
+        <w:t>were</w:t>
+      </w:r>
+      <w:r>
+        <w:rPr>
+          <w:rFonts w:ascii="Arial" w:hAnsi="Arial" w:cs="Arial"/>
+        </w:rPr>
+        <w:t xml:space="preserve"> assessed within the clinical context of the study</w:t>
       </w:r>
       <w:r>
         <w:rPr>
@@ -486,272 +663,19 @@
         <w:rPr>
           <w:rFonts w:ascii="Arial" w:hAnsi="Arial" w:cs="Arial"/>
         </w:rPr>
-        <w:t>e</w:t>
-      </w:r>
-      <w:r>
-        <w:rPr>
-          <w:rFonts w:ascii="Arial" w:hAnsi="Arial" w:cs="Arial"/>
-        </w:rPr>
-        <w:t>.</w:t>
-      </w:r>
-      <w:r>
-        <w:rPr>
-          <w:rFonts w:ascii="Arial" w:hAnsi="Arial" w:cs="Arial"/>
-        </w:rPr>
-        <w:t>, selects the same predictors</w:t>
-      </w:r>
-      <w:r>
-        <w:rPr>
-          <w:rFonts w:ascii="Arial" w:hAnsi="Arial" w:cs="Arial"/>
-        </w:rPr>
-        <w:t xml:space="preserve"> across different random seeds</w:t>
-      </w:r>
-      <w:r>
-        <w:rPr>
-          <w:rFonts w:ascii="Arial" w:hAnsi="Arial" w:cs="Arial"/>
-        </w:rPr>
-        <w:t>)</w:t>
-      </w:r>
-      <w:r>
-        <w:rPr>
-          <w:rFonts w:ascii="Arial" w:hAnsi="Arial" w:cs="Arial"/>
-        </w:rPr>
-        <w:t xml:space="preserve"> and is greater than or equal to the penalty that minimizes </w:t>
-      </w:r>
-      <w:r>
-        <w:rPr>
-          <w:rFonts w:ascii="Arial" w:hAnsi="Arial" w:cs="Arial"/>
-        </w:rPr>
-        <w:t xml:space="preserve">mean cross-validated error </w:t>
-      </w:r>
-      <w:r>
-        <w:rPr>
-          <w:rFonts w:ascii="Arial" w:hAnsi="Arial" w:cs="Arial"/>
-        </w:rPr>
-        <w:t xml:space="preserve">but within </w:t>
-      </w:r>
-      <w:r>
-        <w:rPr>
-          <w:rFonts w:ascii="Arial" w:hAnsi="Arial" w:cs="Arial"/>
-        </w:rPr>
-        <w:t>1 standard error of the minimum</w:t>
-      </w:r>
-      <w:r>
-        <w:rPr>
-          <w:rFonts w:ascii="Arial" w:hAnsi="Arial" w:cs="Arial"/>
-        </w:rPr>
-        <w:t xml:space="preserve"> penalty. </w:t>
-      </w:r>
-      <w:r>
-        <w:rPr>
-          <w:rFonts w:ascii="Arial" w:hAnsi="Arial" w:cs="Arial"/>
-        </w:rPr>
-        <w:t xml:space="preserve">Risk of stroke </w:t>
-      </w:r>
-      <w:r>
-        <w:rPr>
-          <w:rFonts w:ascii="Arial" w:hAnsi="Arial" w:cs="Arial"/>
-        </w:rPr>
-        <w:t xml:space="preserve">was then </w:t>
-      </w:r>
-      <w:r>
-        <w:rPr>
-          <w:rFonts w:ascii="Arial" w:hAnsi="Arial" w:cs="Arial"/>
-        </w:rPr>
-        <w:t>evaluated using Cox proportional hazard model</w:t>
-      </w:r>
-      <w:r>
-        <w:rPr>
-          <w:rFonts w:ascii="Arial" w:hAnsi="Arial" w:cs="Arial"/>
-        </w:rPr>
-        <w:t>s with the variables selected by the LASSO procedure for each sex</w:t>
-      </w:r>
-      <w:r>
-        <w:rPr>
-          <w:rFonts w:ascii="Arial" w:hAnsi="Arial" w:cs="Arial"/>
-        </w:rPr>
-        <w:t xml:space="preserve">. </w:t>
-      </w:r>
-      <w:r>
-        <w:rPr>
-          <w:rFonts w:ascii="Arial" w:hAnsi="Arial" w:cs="Arial"/>
-        </w:rPr>
-        <w:t>The p</w:t>
-      </w:r>
-      <w:r>
-        <w:rPr>
-          <w:rFonts w:ascii="Arial" w:hAnsi="Arial" w:cs="Arial"/>
-        </w:rPr>
-        <w:t xml:space="preserve">roportional hazards assumption for each covariate </w:t>
-      </w:r>
-      <w:r>
-        <w:rPr>
-          <w:rFonts w:ascii="Arial" w:hAnsi="Arial" w:cs="Arial"/>
-        </w:rPr>
-        <w:t xml:space="preserve">was assessed </w:t>
-      </w:r>
-      <w:r>
-        <w:rPr>
-          <w:rFonts w:ascii="Arial" w:hAnsi="Arial" w:cs="Arial"/>
-        </w:rPr>
-        <w:t>using Schoenfeld residuals (</w:t>
-      </w:r>
-      <w:r>
-        <w:rPr>
-          <w:rFonts w:ascii="Arial" w:hAnsi="Arial" w:cs="Arial"/>
-        </w:rPr>
-        <w:t xml:space="preserve">global </w:t>
-      </w:r>
-      <w:r>
-        <w:rPr>
-          <w:rFonts w:ascii="Arial" w:hAnsi="Arial" w:cs="Arial"/>
-        </w:rPr>
-        <w:t xml:space="preserve">p-value threshold: 0.05) and multicollinearity with other covariates using VIF screening (threshold: 5). </w:t>
-      </w:r>
-      <w:r>
-        <w:rPr>
-          <w:rFonts w:ascii="Arial" w:hAnsi="Arial" w:cs="Arial"/>
-        </w:rPr>
-        <w:t>Hazard ratios with 95% confidence intervals were calculated for each selected covariate, as well as t</w:t>
-      </w:r>
-      <w:r>
-        <w:rPr>
-          <w:rFonts w:ascii="Arial" w:hAnsi="Arial" w:cs="Arial"/>
-        </w:rPr>
-        <w:t xml:space="preserve">en-year stroke probabilities for both sexes at age 40, 50, and 60 across the following risk profiles: no baseline risk (determined as the mean level of continuous variables and the absence of categorical risk factors), </w:t>
-      </w:r>
-      <w:r>
-        <w:rPr>
-          <w:rFonts w:ascii="Arial" w:hAnsi="Arial" w:cs="Arial"/>
-        </w:rPr>
-        <w:t>high blood pressure (</w:t>
-      </w:r>
-      <w:r>
-        <w:rPr>
-          <w:rFonts w:ascii="Arial" w:hAnsi="Arial" w:cs="Arial"/>
-        </w:rPr>
-        <w:t xml:space="preserve">systolic </w:t>
-      </w:r>
-      <w:r>
-        <w:rPr>
-          <w:rFonts w:ascii="Arial" w:hAnsi="Arial" w:cs="Arial"/>
-        </w:rPr>
-        <w:t>blood pressure =</w:t>
-      </w:r>
-      <w:r>
-        <w:rPr>
-          <w:rFonts w:ascii="Arial" w:hAnsi="Arial" w:cs="Arial"/>
-        </w:rPr>
-        <w:t xml:space="preserve"> 160</w:t>
-      </w:r>
-      <w:r>
-        <w:rPr>
-          <w:rFonts w:ascii="Arial" w:hAnsi="Arial" w:cs="Arial"/>
-        </w:rPr>
-        <w:t>)</w:t>
-      </w:r>
-      <w:r>
-        <w:rPr>
-          <w:rFonts w:ascii="Arial" w:hAnsi="Arial" w:cs="Arial"/>
-        </w:rPr>
-        <w:t>,</w:t>
-      </w:r>
-      <w:r>
-        <w:rPr>
-          <w:rFonts w:ascii="Arial" w:hAnsi="Arial" w:cs="Arial"/>
-        </w:rPr>
-        <w:t xml:space="preserve"> diabetes</w:t>
-      </w:r>
-      <w:r>
-        <w:rPr>
-          <w:rFonts w:ascii="Arial" w:hAnsi="Arial" w:cs="Arial"/>
-        </w:rPr>
-        <w:t xml:space="preserve">, </w:t>
-      </w:r>
-      <w:r>
-        <w:rPr>
-          <w:rFonts w:ascii="Arial" w:hAnsi="Arial" w:cs="Arial"/>
-        </w:rPr>
-        <w:t>high blood pressure and diabetes</w:t>
-      </w:r>
-      <w:r>
-        <w:rPr>
-          <w:rFonts w:ascii="Arial" w:hAnsi="Arial" w:cs="Arial"/>
-        </w:rPr>
-        <w:t xml:space="preserve">, and </w:t>
-      </w:r>
-      <w:r>
-        <w:rPr>
-          <w:rFonts w:ascii="Arial" w:hAnsi="Arial" w:cs="Arial"/>
-        </w:rPr>
-        <w:lastRenderedPageBreak/>
-        <w:t>smoking</w:t>
-      </w:r>
-      <w:r>
-        <w:rPr>
-          <w:rFonts w:ascii="Arial" w:hAnsi="Arial" w:cs="Arial"/>
-        </w:rPr>
-        <w:t xml:space="preserve">. </w:t>
-      </w:r>
-      <w:r>
-        <w:rPr>
-          <w:rFonts w:ascii="Arial" w:hAnsi="Arial" w:cs="Arial"/>
-        </w:rPr>
-        <w:t xml:space="preserve">Final model discrimination will be evaluated using c-statistics. </w:t>
-      </w:r>
-      <w:r>
-        <w:rPr>
-          <w:rFonts w:ascii="Arial" w:hAnsi="Arial" w:cs="Arial"/>
-        </w:rPr>
-        <w:t>Competing risks such as death and myocardial infarction will not be considered</w:t>
-      </w:r>
-      <w:r>
-        <w:rPr>
-          <w:rFonts w:ascii="Arial" w:hAnsi="Arial" w:cs="Arial"/>
-        </w:rPr>
-        <w:t xml:space="preserve"> in primary analysis</w:t>
-      </w:r>
-      <w:r>
-        <w:rPr>
-          <w:rFonts w:ascii="Arial" w:hAnsi="Arial" w:cs="Arial"/>
-        </w:rPr>
-        <w:t xml:space="preserve">. </w:t>
-      </w:r>
-      <w:r>
-        <w:rPr>
-          <w:rFonts w:ascii="Arial" w:hAnsi="Arial" w:cs="Arial"/>
-        </w:rPr>
-        <w:t>Secondary descriptive analysis will</w:t>
-      </w:r>
-      <w:r>
-        <w:rPr>
-          <w:rFonts w:ascii="Arial" w:hAnsi="Arial" w:cs="Arial"/>
-        </w:rPr>
-        <w:t xml:space="preserve"> present the mean and standard deviation of </w:t>
-      </w:r>
-      <w:r>
-        <w:rPr>
-          <w:rFonts w:ascii="Arial" w:hAnsi="Arial" w:cs="Arial"/>
-        </w:rPr>
-        <w:t>risk factors over the three periods of study to determine if a more complex time-varying survival analysis may be more appropriate</w:t>
-      </w:r>
-      <w:r>
-        <w:rPr>
-          <w:rFonts w:ascii="Arial" w:hAnsi="Arial" w:cs="Arial"/>
-        </w:rPr>
-        <w:t>; no statistical testing will be conducted as meaningful differences will be assessed within the clinical context of the study</w:t>
-      </w:r>
-      <w:r>
-        <w:rPr>
-          <w:rFonts w:ascii="Arial" w:hAnsi="Arial" w:cs="Arial"/>
-        </w:rPr>
-        <w:t>.</w:t>
-      </w:r>
-      <w:r>
-        <w:rPr>
-          <w:rFonts w:ascii="Arial" w:hAnsi="Arial" w:cs="Arial"/>
-        </w:rPr>
-        <w:t xml:space="preserve"> Secondary analysis will be conducted in the cohort of 3,197 individuals with at least one measurement in each period to accurately account for longitudinal patient trajectories.</w:t>
+        <w:t xml:space="preserve"> Secondary analysis </w:t>
+      </w:r>
+      <w:r>
+        <w:rPr>
+          <w:rFonts w:ascii="Arial" w:hAnsi="Arial" w:cs="Arial"/>
+        </w:rPr>
+        <w:t>was</w:t>
+      </w:r>
+      <w:r>
+        <w:rPr>
+          <w:rFonts w:ascii="Arial" w:hAnsi="Arial" w:cs="Arial"/>
+        </w:rPr>
+        <w:t xml:space="preserve"> conducted in the cohort of 3,197 individuals with at least one measurement in each period to accurately account for longitudinal patient trajectories.</w:t>
       </w:r>
       <w:r>
         <w:rPr>
@@ -763,13 +687,37 @@
         <w:rPr>
           <w:rFonts w:ascii="Arial" w:hAnsi="Arial" w:cs="Arial"/>
         </w:rPr>
-        <w:t xml:space="preserve">The alpha threshold for significance will be set at 0.05. </w:t>
-      </w:r>
-      <w:r>
-        <w:rPr>
-          <w:rFonts w:ascii="Arial" w:hAnsi="Arial" w:cs="Arial"/>
-        </w:rPr>
-        <w:t xml:space="preserve">All analysis will be conducted using R version 4.5.1. </w:t>
+        <w:t xml:space="preserve">The alpha threshold for significance </w:t>
+      </w:r>
+      <w:r>
+        <w:rPr>
+          <w:rFonts w:ascii="Arial" w:hAnsi="Arial" w:cs="Arial"/>
+        </w:rPr>
+        <w:t>was</w:t>
+      </w:r>
+      <w:r>
+        <w:rPr>
+          <w:rFonts w:ascii="Arial" w:hAnsi="Arial" w:cs="Arial"/>
+        </w:rPr>
+        <w:t xml:space="preserve"> set at 0.05. </w:t>
+      </w:r>
+      <w:r>
+        <w:rPr>
+          <w:rFonts w:ascii="Arial" w:hAnsi="Arial" w:cs="Arial"/>
+        </w:rPr>
+        <w:t xml:space="preserve">All analysis </w:t>
+      </w:r>
+      <w:r>
+        <w:rPr>
+          <w:rFonts w:ascii="Arial" w:hAnsi="Arial" w:cs="Arial"/>
+        </w:rPr>
+        <w:t>was</w:t>
+      </w:r>
+      <w:r>
+        <w:rPr>
+          <w:rFonts w:ascii="Arial" w:hAnsi="Arial" w:cs="Arial"/>
+        </w:rPr>
+        <w:t xml:space="preserve"> conducted using R version 4.5.1. </w:t>
       </w:r>
     </w:p>
     <w:p>
@@ -846,31 +794,13 @@
         <w:rPr>
           <w:rFonts w:ascii="Arial" w:hAnsi="Arial" w:cs="Arial"/>
         </w:rPr>
-        <w:t xml:space="preserve"> to retain </w:t>
-      </w:r>
-      <w:r>
-        <w:rPr>
-          <w:rFonts w:ascii="Arial" w:hAnsi="Arial" w:cs="Arial"/>
-        </w:rPr>
-        <w:t>several predictors with signal</w:t>
-      </w:r>
-      <w:r>
-        <w:rPr>
-          <w:rFonts w:ascii="Arial" w:hAnsi="Arial" w:cs="Arial"/>
-        </w:rPr>
-        <w:t>s, avoiding overly sparse final models.</w:t>
-      </w:r>
-      <w:r>
-        <w:rPr>
-          <w:rFonts w:ascii="Arial" w:hAnsi="Arial" w:cs="Arial"/>
-        </w:rPr>
-        <w:t xml:space="preserve"> Final variable selection included age, systolic blood pressure, diabetes, smoking, and coronary heart disease in both male and female models. Schoenfeld residual plots indicate overall </w:t>
-      </w:r>
-      <w:r>
-        <w:rPr>
-          <w:rFonts w:ascii="Arial" w:hAnsi="Arial" w:cs="Arial"/>
-        </w:rPr>
-        <w:t xml:space="preserve">adherence to Cox </w:t>
+        <w:t xml:space="preserve"> to retain several predictors with signals, avoiding overly sparse final models.</w:t>
+      </w:r>
+      <w:r>
+        <w:rPr>
+          <w:rFonts w:ascii="Arial" w:hAnsi="Arial" w:cs="Arial"/>
+        </w:rPr>
+        <w:t xml:space="preserve"> Final variable selection included age, systolic blood pressure, diabetes, smoking, and coronary heart disease in both male and female models. Schoenfeld residual plots indicate overall adherence to Cox </w:t>
       </w:r>
       <w:r>
         <w:rPr>
@@ -882,13 +812,49 @@
         <w:rPr>
           <w:rFonts w:ascii="Arial" w:hAnsi="Arial" w:cs="Arial"/>
         </w:rPr>
-        <w:t xml:space="preserve"> assumptions, with a possible violation in the smoker variable</w:t>
-      </w:r>
-      <w:r>
-        <w:rPr>
-          <w:rFonts w:ascii="Arial" w:hAnsi="Arial" w:cs="Arial"/>
-        </w:rPr>
-        <w:t xml:space="preserve"> in the female model. (Supplemental Figure 1, 2)</w:t>
+        <w:t xml:space="preserve"> assumptions, with a possible violation in the smoker variable in the female model. (Supplemental Figure 1, 2) For both male and female model</w:t>
+      </w:r>
+      <w:r>
+        <w:rPr>
+          <w:rFonts w:ascii="Arial" w:hAnsi="Arial" w:cs="Arial"/>
+        </w:rPr>
+        <w:t>s</w:t>
+      </w:r>
+      <w:r>
+        <w:rPr>
+          <w:rFonts w:ascii="Arial" w:hAnsi="Arial" w:cs="Arial"/>
+        </w:rPr>
+        <w:t xml:space="preserve">, global Schoenfeld residual tests yield p &gt; 0.05, indicating no evidence that proportional hazard assumptions are violated. </w:t>
+      </w:r>
+      <w:r>
+        <w:rPr>
+          <w:rFonts w:ascii="Arial" w:hAnsi="Arial" w:cs="Arial"/>
+        </w:rPr>
+        <w:t xml:space="preserve">No multicollinearity was observed in the final Cox models. </w:t>
+      </w:r>
+      <w:r>
+        <w:rPr>
+          <w:rFonts w:ascii="Arial" w:hAnsi="Arial" w:cs="Arial"/>
+        </w:rPr>
+        <w:t xml:space="preserve">The male model had a c-statistic of 0.77, while the female model had 0.72, indicating acceptable discrimination across both models. Hazard ratios are presented in Table 4. On average, males tend to be predicted to have a higher probability of stroke than females. (Figure 1) </w:t>
+      </w:r>
+      <w:r>
+        <w:rPr>
+          <w:rFonts w:ascii="Arial" w:hAnsi="Arial" w:cs="Arial"/>
+        </w:rPr>
+        <w:t xml:space="preserve">Across the selected risk profiles for men between ages 40-60, the overall predicted probability of a stroke within ten years is between 4.0 – 44.8 %, while for women it is between 3.09 – 27.1%. </w:t>
+      </w:r>
+      <w:r>
+        <w:rPr>
+          <w:rFonts w:ascii="Arial" w:hAnsi="Arial" w:cs="Arial"/>
+        </w:rPr>
+        <w:t xml:space="preserve">Age, diabetes, smoking, and blood pressure </w:t>
+      </w:r>
+      <w:r>
+        <w:rPr>
+          <w:rFonts w:ascii="Arial" w:hAnsi="Arial" w:cs="Arial"/>
+        </w:rPr>
+        <w:t>are all associated with</w:t>
       </w:r>
       <w:r>
         <w:rPr>
@@ -900,49 +866,61 @@
         <w:rPr>
           <w:rFonts w:ascii="Arial" w:hAnsi="Arial" w:cs="Arial"/>
         </w:rPr>
-        <w:t xml:space="preserve">For both male and female model, global Schoenfeld residual tests yield p &gt; 0.05, </w:t>
-      </w:r>
-      <w:r>
-        <w:rPr>
-          <w:rFonts w:ascii="Arial" w:hAnsi="Arial" w:cs="Arial"/>
-        </w:rPr>
-        <w:t>indicating no evidence that proportional hazard assumptions are violated.</w:t>
-      </w:r>
-      <w:r>
-        <w:rPr>
-          <w:rFonts w:ascii="Arial" w:hAnsi="Arial" w:cs="Arial"/>
-        </w:rPr>
-        <w:t xml:space="preserve"> </w:t>
-      </w:r>
-      <w:r>
-        <w:rPr>
-          <w:rFonts w:ascii="Arial" w:hAnsi="Arial" w:cs="Arial"/>
-        </w:rPr>
-        <w:t xml:space="preserve">No multicollinearity was observed in the final Cox models. </w:t>
-      </w:r>
-      <w:r>
-        <w:rPr>
-          <w:rFonts w:ascii="Arial" w:hAnsi="Arial" w:cs="Arial"/>
-        </w:rPr>
-        <w:t xml:space="preserve">The male model had a c-statistic of 0.77, while the female model had 0.72, indicating acceptable discrimination across both models. Hazard ratios are presented in Table 4. On average, males tend to be predicted to have a higher probability of stroke than females. (Figure 1) </w:t>
-      </w:r>
-      <w:r>
-        <w:rPr>
-          <w:rFonts w:ascii="Arial" w:hAnsi="Arial" w:cs="Arial"/>
-        </w:rPr>
-        <w:t xml:space="preserve">Across the selected risk profiles for men between ages 40-60, the overall predicted probability of a stroke within ten years is between 4.0 – 44.8 %, while for women it is between 3.09 – 27.1%. </w:t>
-      </w:r>
-      <w:r>
-        <w:rPr>
-          <w:rFonts w:ascii="Arial" w:hAnsi="Arial" w:cs="Arial"/>
-        </w:rPr>
-        <w:t xml:space="preserve">Age, diabetes, smoking, and blood pressure all raise the predicted probability of stroke in both males and females, while a combination of diabetes and high blood pressure is the risk profile with the largest probability of stroke. </w:t>
-      </w:r>
-      <w:r>
-        <w:rPr>
-          <w:rFonts w:ascii="Arial" w:hAnsi="Arial" w:cs="Arial"/>
-        </w:rPr>
-        <w:t xml:space="preserve">(Table 2, 3) Secondary analysis highlights the change in covariates across the three periods of study, with the average systolic blood pressure, incidence of diabetes and coronary heart disease, and use of blood pressure medication increasing while smoking levels decreased over the period.  </w:t>
+        <w:t xml:space="preserve">larger </w:t>
+      </w:r>
+      <w:r>
+        <w:rPr>
+          <w:rFonts w:ascii="Arial" w:hAnsi="Arial" w:cs="Arial"/>
+        </w:rPr>
+        <w:t>predicted probabilit</w:t>
+      </w:r>
+      <w:r>
+        <w:rPr>
+          <w:rFonts w:ascii="Arial" w:hAnsi="Arial" w:cs="Arial"/>
+        </w:rPr>
+        <w:t xml:space="preserve">ies </w:t>
+      </w:r>
+      <w:r>
+        <w:rPr>
+          <w:rFonts w:ascii="Arial" w:hAnsi="Arial" w:cs="Arial"/>
+        </w:rPr>
+        <w:t xml:space="preserve">of stroke in both males and females, while a combination of diabetes and high blood pressure is the risk profile </w:t>
+      </w:r>
+      <w:r>
+        <w:rPr>
+          <w:rFonts w:ascii="Arial" w:hAnsi="Arial" w:cs="Arial"/>
+        </w:rPr>
+        <w:t xml:space="preserve">associated </w:t>
+      </w:r>
+      <w:r>
+        <w:rPr>
+          <w:rFonts w:ascii="Arial" w:hAnsi="Arial" w:cs="Arial"/>
+        </w:rPr>
+        <w:t xml:space="preserve">with the largest probability of stroke. </w:t>
+      </w:r>
+      <w:r>
+        <w:rPr>
+          <w:rFonts w:ascii="Arial" w:hAnsi="Arial" w:cs="Arial"/>
+        </w:rPr>
+        <w:t xml:space="preserve">(Table 2, 3) Secondary analysis highlights the change in covariates across the three periods of study, with the average systolic blood pressure, incidence of diabetes and coronary heart disease, and use of blood pressure medication increasing while smoking levels decreased over the period. </w:t>
+      </w:r>
+      <w:r>
+        <w:rPr>
+          <w:rFonts w:ascii="Arial" w:hAnsi="Arial" w:cs="Arial"/>
+        </w:rPr>
+        <w:t xml:space="preserve">(Table </w:t>
+      </w:r>
+      <w:r>
+        <w:rPr>
+          <w:rFonts w:ascii="Arial" w:hAnsi="Arial" w:cs="Arial"/>
+        </w:rPr>
+        <w:t>5</w:t>
+      </w:r>
+      <w:r>
+        <w:rPr>
+          <w:rFonts w:ascii="Arial" w:hAnsi="Arial" w:cs="Arial"/>
+        </w:rPr>
+        <w:t>)</w:t>
       </w:r>
     </w:p>
     <w:p>
@@ -1021,7 +999,68 @@
         <w:rPr>
           <w:rFonts w:ascii="Arial" w:hAnsi="Arial" w:cs="Arial"/>
         </w:rPr>
-        <w:t xml:space="preserve"> A combination of diabetes and high blood pressure led to the highest predicted probability of stroke for both men and women, while diabetes alone was associated with the highest hazard among selected risk profiles. Secondary analysis shows some imbalance in covariates across the study period, suggesting that a more complex time-varying survival analysis may be necessary to capture long-term trends in stroke outcomes. Notably, smoking proportion decreased significantly over the course of the study, likely due to updated medical guidelines regarding the practice at the time. Further study should include additional risk profiles, including coronary heart disease, and their joint effect with other common comorbidities. Additionally, LASSO variable selection at the minimum mean cross-validated error penalty term yielded unstable estimates, while the boundary penalty term one standard error away from the minimum yielded sparse models. As such, sensitivity analysis should be conducted to determine the change in computed probabilities with both a sparser and more packed covariate model, in conjunction with additional literature review to determine the most key predictors of stroke. Additionally, this project did not include any adjustment for the competing risks of death or MI, which all competing events are treated as a stroke, thus </w:t>
+        <w:t xml:space="preserve"> A combination of diabetes and high blood pressure </w:t>
+      </w:r>
+      <w:r>
+        <w:rPr>
+          <w:rFonts w:ascii="Arial" w:hAnsi="Arial" w:cs="Arial"/>
+        </w:rPr>
+        <w:t xml:space="preserve">was associated with </w:t>
+      </w:r>
+      <w:r>
+        <w:rPr>
+          <w:rFonts w:ascii="Arial" w:hAnsi="Arial" w:cs="Arial"/>
+        </w:rPr>
+        <w:t xml:space="preserve">the highest predicted probability of stroke for both men and women, while diabetes alone was associated with the highest hazard among selected risk profiles. Secondary analysis shows some imbalance in covariates across the study period, suggesting that a more complex time-varying survival analysis may be necessary to capture long-term trends in stroke outcomes. Notably, smoking proportion decreased significantly over the course of the study, likely due to updated medical guidelines regarding the practice at the time. </w:t>
+      </w:r>
+      <w:r>
+        <w:rPr>
+          <w:rFonts w:ascii="Arial" w:hAnsi="Arial" w:cs="Arial"/>
+        </w:rPr>
+        <w:t>Results with a time varying analysis may be more precise</w:t>
+      </w:r>
+      <w:r>
+        <w:rPr>
+          <w:rFonts w:ascii="Arial" w:hAnsi="Arial" w:cs="Arial"/>
+        </w:rPr>
+        <w:t xml:space="preserve"> by accounting for changing baseline states due to worsening health outcomes over time, reducing bias and leading to more accurate hazard ratios. </w:t>
+      </w:r>
+      <w:r>
+        <w:rPr>
+          <w:rFonts w:ascii="Arial" w:hAnsi="Arial" w:cs="Arial"/>
+        </w:rPr>
+        <w:t xml:space="preserve">Further study should include additional risk profiles, including coronary heart disease, and their joint effect with other common comorbidities. Additionally, LASSO variable selection at the minimum mean cross-validated error penalty term yielded unstable estimates, while the boundary penalty term one standard error away from the minimum yielded sparse models. As such, sensitivity analysis should be conducted to determine the change in computed probabilities with both a sparser and more packed covariate model, in conjunction with additional literature review to determine the most key predictors of stroke. Additionally, this project did not include any adjustment for the competing risks </w:t>
+      </w:r>
+      <w:r>
+        <w:rPr>
+          <w:rFonts w:ascii="Arial" w:hAnsi="Arial" w:cs="Arial"/>
+        </w:rPr>
+        <w:lastRenderedPageBreak/>
+        <w:t xml:space="preserve">of death or MI, </w:t>
+      </w:r>
+      <w:r>
+        <w:rPr>
+          <w:rFonts w:ascii="Arial" w:hAnsi="Arial" w:cs="Arial"/>
+        </w:rPr>
+        <w:t>instead treating all</w:t>
+      </w:r>
+      <w:r>
+        <w:rPr>
+          <w:rFonts w:ascii="Arial" w:hAnsi="Arial" w:cs="Arial"/>
+        </w:rPr>
+        <w:t xml:space="preserve"> competing events as</w:t>
+      </w:r>
+      <w:r>
+        <w:rPr>
+          <w:rFonts w:ascii="Arial" w:hAnsi="Arial" w:cs="Arial"/>
+        </w:rPr>
+        <w:t xml:space="preserve"> </w:t>
+      </w:r>
+      <w:r>
+        <w:rPr>
+          <w:rFonts w:ascii="Arial" w:hAnsi="Arial" w:cs="Arial"/>
+        </w:rPr>
+        <w:t xml:space="preserve">stroke, thus </w:t>
       </w:r>
       <w:r>
         <w:rPr>
@@ -1092,7 +1131,19 @@
         <w:rPr>
           <w:rFonts w:ascii="Arial" w:hAnsi="Arial" w:cs="Arial"/>
         </w:rPr>
-        <w:t xml:space="preserve">Claude Opus v4.7 was used to debug code and aid in table and plot creation within this assignment. Dataset and investigator guidance were provided via Dr. Elizabeth Wynn. </w:t>
+        <w:t xml:space="preserve">Claude Opus v4.7 was used to debug code and aid in table and plot creation within this assignment. Dataset and investigator guidance were provided </w:t>
+      </w:r>
+      <w:r>
+        <w:rPr>
+          <w:rFonts w:ascii="Arial" w:hAnsi="Arial" w:cs="Arial"/>
+        </w:rPr>
+        <w:t>by</w:t>
+      </w:r>
+      <w:r>
+        <w:rPr>
+          <w:rFonts w:ascii="Arial" w:hAnsi="Arial" w:cs="Arial"/>
+        </w:rPr>
+        <w:t xml:space="preserve"> Dr. Elizabeth Wynn. </w:t>
       </w:r>
     </w:p>
     <w:p>
@@ -1151,7 +1202,21 @@
             <w:rStyle w:val="Hyperlink"/>
             <w:rFonts w:ascii="Arial" w:hAnsi="Arial" w:cs="Arial"/>
           </w:rPr>
-          <w:t>https://github.com/MarshallRoll/Advanced_Methods_Roll/tree/main/Project%203</w:t>
+          <w:t>https://githu</w:t>
+        </w:r>
+        <w:r>
+          <w:rPr>
+            <w:rStyle w:val="Hyperlink"/>
+            <w:rFonts w:ascii="Arial" w:hAnsi="Arial" w:cs="Arial"/>
+          </w:rPr>
+          <w:t>b</w:t>
+        </w:r>
+        <w:r>
+          <w:rPr>
+            <w:rStyle w:val="Hyperlink"/>
+            <w:rFonts w:ascii="Arial" w:hAnsi="Arial" w:cs="Arial"/>
+          </w:rPr>
+          <w:t>.com/MarshallRoll/Advanced_Methods_Roll/tree/main/Project%203</w:t>
         </w:r>
       </w:hyperlink>
     </w:p>
@@ -1199,10 +1264,10 @@
         <w:tblLook w:val="0000" w:firstRow="0" w:lastRow="0" w:firstColumn="0" w:lastColumn="0" w:noHBand="0" w:noVBand="0"/>
       </w:tblPr>
       <w:tblGrid>
-        <w:gridCol w:w="2989"/>
-        <w:gridCol w:w="2137"/>
-        <w:gridCol w:w="2151"/>
-        <w:gridCol w:w="1857"/>
+        <w:gridCol w:w="2511"/>
+        <w:gridCol w:w="1799"/>
+        <w:gridCol w:w="1810"/>
+        <w:gridCol w:w="1566"/>
       </w:tblGrid>
       <w:tr>
         <w:trPr>
@@ -5965,23 +6030,7 @@
           <w:sz w:val="22"/>
           <w:szCs w:val="22"/>
         </w:rPr>
-        <w:t xml:space="preserve">Estimated 10-year stroke probability across risk profiles for </w:t>
-      </w:r>
-      <w:r>
-        <w:rPr>
-          <w:rFonts w:ascii="Arial" w:hAnsi="Arial" w:cs="Arial"/>
-          <w:sz w:val="22"/>
-          <w:szCs w:val="22"/>
-        </w:rPr>
-        <w:t>fe</w:t>
-      </w:r>
-      <w:r>
-        <w:rPr>
-          <w:rFonts w:ascii="Arial" w:hAnsi="Arial" w:cs="Arial"/>
-          <w:sz w:val="22"/>
-          <w:szCs w:val="22"/>
-        </w:rPr>
-        <w:t xml:space="preserve">males. 95% confidence intervals calculated with log-transformation.  </w:t>
+        <w:t xml:space="preserve">Estimated 10-year stroke probability across risk profiles for females. 95% confidence intervals calculated with log-transformation.  </w:t>
       </w:r>
     </w:p>
     <w:p>
@@ -7482,23 +7531,7 @@
           <w:b/>
           <w:bCs/>
         </w:rPr>
-        <w:t xml:space="preserve">Table </w:t>
-      </w:r>
-      <w:r>
-        <w:rPr>
-          <w:rFonts w:ascii="Arial" w:hAnsi="Arial" w:cs="Arial"/>
-          <w:b/>
-          <w:bCs/>
-        </w:rPr>
-        <w:t>4</w:t>
-      </w:r>
-      <w:r>
-        <w:rPr>
-          <w:rFonts w:ascii="Arial" w:hAnsi="Arial" w:cs="Arial"/>
-          <w:b/>
-          <w:bCs/>
-        </w:rPr>
-        <w:t xml:space="preserve">: </w:t>
+        <w:t xml:space="preserve">Table 4: </w:t>
       </w:r>
       <w:r>
         <w:rPr>
@@ -7660,10 +7693,10 @@
         <w:tblLook w:val="0000" w:firstRow="0" w:lastRow="0" w:firstColumn="0" w:lastColumn="0" w:noHBand="0" w:noVBand="0"/>
       </w:tblPr>
       <w:tblGrid>
-        <w:gridCol w:w="3549"/>
-        <w:gridCol w:w="1937"/>
-        <w:gridCol w:w="1937"/>
-        <w:gridCol w:w="1937"/>
+        <w:gridCol w:w="3513"/>
+        <w:gridCol w:w="1949"/>
+        <w:gridCol w:w="1949"/>
+        <w:gridCol w:w="1949"/>
       </w:tblGrid>
       <w:tr>
         <w:trPr>
@@ -9113,7 +9146,6 @@
               <w:rPr>
                 <w:rFonts w:ascii="Arial" w:hAnsi="Arial" w:cs="Arial"/>
                 <w:i/>
-                <w:sz w:val="20"/>
                 <w:vertAlign w:val="superscript"/>
               </w:rPr>
               <w:t>1</w:t>
@@ -9121,7 +9153,6 @@
             <w:r>
               <w:rPr>
                 <w:rFonts w:ascii="Arial" w:hAnsi="Arial" w:cs="Arial"/>
-                <w:sz w:val="20"/>
               </w:rPr>
               <w:t>Mean (SD); n (%)</w:t>
             </w:r>
@@ -9382,65 +9413,13 @@
           <w:b/>
           <w:bCs/>
         </w:rPr>
-        <w:t xml:space="preserve">Supplemental Figure </w:t>
-      </w:r>
-      <w:r>
-        <w:rPr>
-          <w:rFonts w:ascii="Arial" w:hAnsi="Arial" w:cs="Arial"/>
-          <w:b/>
-          <w:bCs/>
-        </w:rPr>
-        <w:t>2</w:t>
-      </w:r>
-      <w:r>
-        <w:rPr>
-          <w:rFonts w:ascii="Arial" w:hAnsi="Arial" w:cs="Arial"/>
-          <w:b/>
-          <w:bCs/>
-        </w:rPr>
-        <w:t xml:space="preserve">: </w:t>
-      </w:r>
-      <w:r>
-        <w:rPr>
-          <w:rFonts w:ascii="Arial" w:hAnsi="Arial" w:cs="Arial"/>
-        </w:rPr>
-        <w:t xml:space="preserve">Schoenfeld residuals across covariates included in final survival model for </w:t>
-      </w:r>
-      <w:r>
-        <w:rPr>
-          <w:rFonts w:ascii="Arial" w:hAnsi="Arial" w:cs="Arial"/>
-        </w:rPr>
-        <w:t>fe</w:t>
-      </w:r>
-      <w:r>
-        <w:rPr>
-          <w:rFonts w:ascii="Arial" w:hAnsi="Arial" w:cs="Arial"/>
-        </w:rPr>
-        <w:t xml:space="preserve">males, indicating </w:t>
-      </w:r>
-      <w:r>
-        <w:rPr>
-          <w:rFonts w:ascii="Arial" w:hAnsi="Arial" w:cs="Arial"/>
-        </w:rPr>
-        <w:t xml:space="preserve">moderate </w:t>
-      </w:r>
-      <w:r>
-        <w:rPr>
-          <w:rFonts w:ascii="Arial" w:hAnsi="Arial" w:cs="Arial"/>
-        </w:rPr>
-        <w:t>adherence to Cox PH assumptions</w:t>
-      </w:r>
-      <w:r>
-        <w:rPr>
-          <w:rFonts w:ascii="Arial" w:hAnsi="Arial" w:cs="Arial"/>
-        </w:rPr>
-        <w:t>, with a possible violation in the smoker variable</w:t>
-      </w:r>
-      <w:r>
-        <w:rPr>
-          <w:rFonts w:ascii="Arial" w:hAnsi="Arial" w:cs="Arial"/>
-        </w:rPr>
-        <w:t>. Global test yields p &gt; 0.05, indicating no evidence that proportional hazard assumptions are violated.</w:t>
+        <w:t xml:space="preserve">Supplemental Figure 2: </w:t>
+      </w:r>
+      <w:r>
+        <w:rPr>
+          <w:rFonts w:ascii="Arial" w:hAnsi="Arial" w:cs="Arial"/>
+        </w:rPr>
+        <w:t>Schoenfeld residuals across covariates included in final survival model for females, indicating moderate adherence to Cox PH assumptions, with a possible violation in the smoker variable. Global test yields p &gt; 0.05, indicating no evidence that proportional hazard assumptions are violated.</w:t>
       </w:r>
     </w:p>
     <w:p>
@@ -9529,21 +9508,7 @@
         <w:rPr>
           <w:rFonts w:ascii="Arial" w:hAnsi="Arial" w:cs="Arial"/>
         </w:rPr>
-        <w:t xml:space="preserve">LASSO coefficient path across differing lambda values, with </w:t>
-      </w:r>
-      <w:proofErr w:type="spellStart"/>
-      <w:r>
-        <w:rPr>
-          <w:rFonts w:ascii="Arial" w:hAnsi="Arial" w:cs="Arial"/>
-        </w:rPr>
-        <w:t>lambda.min</w:t>
-      </w:r>
-      <w:proofErr w:type="spellEnd"/>
-      <w:r>
-        <w:rPr>
-          <w:rFonts w:ascii="Arial" w:hAnsi="Arial" w:cs="Arial"/>
-        </w:rPr>
-        <w:t xml:space="preserve"> indicating the lambda value </w:t>
+        <w:t xml:space="preserve">LASSO coefficient path across differing lambda values, with lambda.min indicating the lambda value </w:t>
       </w:r>
       <w:r>
         <w:rPr>
@@ -9591,33 +9556,7 @@
         <w:rPr>
           <w:rFonts w:ascii="Arial" w:hAnsi="Arial" w:cs="Arial"/>
         </w:rPr>
-        <w:t>(</w:t>
-      </w:r>
-      <w:proofErr w:type="gramStart"/>
-      <w:r>
-        <w:rPr>
-          <w:rFonts w:ascii="Arial" w:hAnsi="Arial" w:cs="Arial"/>
-        </w:rPr>
-        <w:t>exp(</w:t>
-      </w:r>
-      <w:proofErr w:type="gramEnd"/>
-      <w:r>
-        <w:rPr>
-          <w:rFonts w:ascii="Arial" w:hAnsi="Arial" w:cs="Arial"/>
-        </w:rPr>
-        <w:t>-</w:t>
-      </w:r>
-      <w:r>
-        <w:rPr>
-          <w:rFonts w:ascii="Arial" w:hAnsi="Arial" w:cs="Arial"/>
-        </w:rPr>
-        <w:t>4</w:t>
-      </w:r>
-      <w:r>
-        <w:rPr>
-          <w:rFonts w:ascii="Arial" w:hAnsi="Arial" w:cs="Arial"/>
-        </w:rPr>
-        <w:t xml:space="preserve">)) </w:t>
+        <w:t xml:space="preserve">(exp(-4)) </w:t>
       </w:r>
       <w:r>
         <w:rPr>
@@ -9629,21 +9568,7 @@
         <w:rPr>
           <w:rFonts w:ascii="Arial" w:hAnsi="Arial" w:cs="Arial"/>
         </w:rPr>
-        <w:t xml:space="preserve"> selected as an interim value between </w:t>
-      </w:r>
-      <w:proofErr w:type="spellStart"/>
-      <w:r>
-        <w:rPr>
-          <w:rFonts w:ascii="Arial" w:hAnsi="Arial" w:cs="Arial"/>
-        </w:rPr>
-        <w:t>lambda.min</w:t>
-      </w:r>
-      <w:proofErr w:type="spellEnd"/>
-      <w:r>
-        <w:rPr>
-          <w:rFonts w:ascii="Arial" w:hAnsi="Arial" w:cs="Arial"/>
-        </w:rPr>
-        <w:t xml:space="preserve"> and lambda.1se where several predictors with large </w:t>
+        <w:t xml:space="preserve"> selected as an interim value between lambda.min and lambda.1se where several predictors with large </w:t>
       </w:r>
       <w:r>
         <w:rPr>
@@ -9738,95 +9663,25 @@
           <w:b/>
           <w:bCs/>
         </w:rPr>
-        <w:t xml:space="preserve">Supplemental Figure </w:t>
-      </w:r>
-      <w:r>
-        <w:rPr>
-          <w:rFonts w:ascii="Arial" w:hAnsi="Arial" w:cs="Arial"/>
-          <w:b/>
-          <w:bCs/>
-        </w:rPr>
-        <w:t>4</w:t>
-      </w:r>
-      <w:r>
-        <w:rPr>
-          <w:rFonts w:ascii="Arial" w:hAnsi="Arial" w:cs="Arial"/>
-          <w:b/>
-          <w:bCs/>
-        </w:rPr>
-        <w:t xml:space="preserve">: </w:t>
-      </w:r>
-      <w:r>
-        <w:rPr>
-          <w:rFonts w:ascii="Arial" w:hAnsi="Arial" w:cs="Arial"/>
-        </w:rPr>
-        <w:t xml:space="preserve">LASSO coefficient path across differing lambda values, with </w:t>
-      </w:r>
-      <w:proofErr w:type="spellStart"/>
-      <w:r>
-        <w:rPr>
-          <w:rFonts w:ascii="Arial" w:hAnsi="Arial" w:cs="Arial"/>
-        </w:rPr>
-        <w:t>lambda.min</w:t>
-      </w:r>
-      <w:proofErr w:type="spellEnd"/>
-      <w:r>
-        <w:rPr>
-          <w:rFonts w:ascii="Arial" w:hAnsi="Arial" w:cs="Arial"/>
-        </w:rPr>
-        <w:t xml:space="preserve"> indicating the lambda value minimizing mean cross-validated error and lambda.1se indicating the largest lambda value within 1 standard error of the minimum</w:t>
-      </w:r>
-      <w:r>
-        <w:rPr>
-          <w:rFonts w:ascii="Arial" w:hAnsi="Arial" w:cs="Arial"/>
-        </w:rPr>
-        <w:t xml:space="preserve"> for female model</w:t>
-      </w:r>
-      <w:r>
-        <w:rPr>
-          <w:rFonts w:ascii="Arial" w:hAnsi="Arial" w:cs="Arial"/>
-        </w:rPr>
-        <w:t xml:space="preserve">. Lambda </w:t>
-      </w:r>
-      <w:r>
-        <w:rPr>
-          <w:rFonts w:ascii="Arial" w:hAnsi="Arial" w:cs="Arial"/>
-        </w:rPr>
-        <w:t>(</w:t>
-      </w:r>
-      <w:proofErr w:type="gramStart"/>
-      <w:r>
-        <w:rPr>
-          <w:rFonts w:ascii="Arial" w:hAnsi="Arial" w:cs="Arial"/>
-        </w:rPr>
-        <w:t>exp(</w:t>
-      </w:r>
-      <w:proofErr w:type="gramEnd"/>
-      <w:r>
-        <w:rPr>
-          <w:rFonts w:ascii="Arial" w:hAnsi="Arial" w:cs="Arial"/>
-        </w:rPr>
-        <w:t xml:space="preserve">-5)) </w:t>
-      </w:r>
-      <w:r>
-        <w:rPr>
-          <w:rFonts w:ascii="Arial" w:hAnsi="Arial" w:cs="Arial"/>
-        </w:rPr>
-        <w:t xml:space="preserve">was selected as an interim value between </w:t>
-      </w:r>
-      <w:proofErr w:type="spellStart"/>
-      <w:r>
-        <w:rPr>
-          <w:rFonts w:ascii="Arial" w:hAnsi="Arial" w:cs="Arial"/>
-        </w:rPr>
-        <w:t>lambda.min</w:t>
-      </w:r>
-      <w:proofErr w:type="spellEnd"/>
-      <w:r>
-        <w:rPr>
-          <w:rFonts w:ascii="Arial" w:hAnsi="Arial" w:cs="Arial"/>
-        </w:rPr>
-        <w:t xml:space="preserve"> and lambda.1se where several predictors with large signals are retained in the final model.</w:t>
+        <w:t xml:space="preserve">Supplemental Figure 4: </w:t>
+      </w:r>
+      <w:r>
+        <w:rPr>
+          <w:rFonts w:ascii="Arial" w:hAnsi="Arial" w:cs="Arial"/>
+        </w:rPr>
+        <w:t xml:space="preserve">LASSO coefficient path across differing lambda values, with lambda.min indicating the lambda value minimizing mean cross-validated error and lambda.1se indicating the largest lambda value within 1 standard error of the minimum for female model. Lambda </w:t>
+      </w:r>
+      <w:r>
+        <w:rPr>
+          <w:rFonts w:ascii="Arial" w:hAnsi="Arial" w:cs="Arial"/>
+        </w:rPr>
+        <w:t xml:space="preserve">(exp(-5)) </w:t>
+      </w:r>
+      <w:r>
+        <w:rPr>
+          <w:rFonts w:ascii="Arial" w:hAnsi="Arial" w:cs="Arial"/>
+        </w:rPr>
+        <w:t>was selected as an interim value between lambda.min and lambda.1se where several predictors with large signals are retained in the final model.</w:t>
       </w:r>
     </w:p>
     <w:p>
@@ -10507,6 +10362,7 @@
   <w:style w:type="character" w:default="1" w:styleId="DefaultParagraphFont">
     <w:name w:val="Default Paragraph Font"/>
     <w:uiPriority w:val="1"/>
+    <w:semiHidden/>
     <w:unhideWhenUsed/>
   </w:style>
   <w:style w:type="table" w:default="1" w:styleId="TableNormal">
@@ -10831,6 +10687,8 @@
     </w:pPr>
     <w:rPr>
       <w:kern w:val="0"/>
+      <w:sz w:val="20"/>
+      <w:szCs w:val="20"/>
       <w14:ligatures w14:val="none"/>
     </w:rPr>
     <w:tblPr>
@@ -10962,6 +10820,18 @@
     <w:rPr>
       <w:color w:val="605E5C"/>
       <w:shd w:val="clear" w:color="auto" w:fill="E1DFDD"/>
+    </w:rPr>
+  </w:style>
+  <w:style w:type="character" w:styleId="FollowedHyperlink">
+    <w:name w:val="FollowedHyperlink"/>
+    <w:basedOn w:val="DefaultParagraphFont"/>
+    <w:uiPriority w:val="99"/>
+    <w:semiHidden/>
+    <w:unhideWhenUsed/>
+    <w:rsid w:val="00FB4603"/>
+    <w:rPr>
+      <w:color w:val="96607D" w:themeColor="followedHyperlink"/>
+      <w:u w:val="single"/>
     </w:rPr>
   </w:style>
 </w:styles>

</xml_diff>